<commit_message>
Configuracion LAN US/New York + Configuracion Guardada para routers
</commit_message>
<xml_diff>
--- a/Proyecto Redes I.docx
+++ b/Proyecto Redes I.docx
@@ -22876,7 +22876,18 @@
                 <w:lang w:val="es-HN"/>
                 <w14:ligatures w14:val="none"/>
               </w:rPr>
-              <w:t>128</w:t>
+              <w:t>12</w:t>
+            </w:r>
+            <w:r>
+              <w:rPr>
+                <w:rFonts w:ascii="Aptos" w:eastAsia="Times New Roman" w:hAnsi="Aptos" w:cs="Times New Roman"/>
+                <w:kern w:val="0"/>
+                <w:sz w:val="16"/>
+                <w:szCs w:val="16"/>
+                <w:lang w:val="es-HN"/>
+                <w14:ligatures w14:val="none"/>
+              </w:rPr>
+              <w:t>9</w:t>
             </w:r>
           </w:p>
         </w:tc>

</xml_diff>